<commit_message>
Docs: fix demo script numbering
Co-Authored-By: Claude Sonnet 5 <noreply@anthropic.com>
</commit_message>
<xml_diff>
--- a/docs/SealTrail_Explanation.docx
+++ b/docs/SealTrail_Explanation.docx
@@ -1211,10 +1211,10 @@
     </w:p>
     <w:p>
       <w:pPr>
-        <w:pStyle w:val="ListBullet2"/>
+        <w:ind w:left="510" w:hanging="340"/>
       </w:pPr>
       <w:r>
-        <w:t xml:space="preserve">Then try "Change who approved": </w:t>
+        <w:t xml:space="preserve">6.  Then try "Change who approved": </w:t>
       </w:r>
       <w:r>
         <w:rPr>
@@ -1231,7 +1231,7 @@
         <w:ind w:left="510" w:hanging="340"/>
       </w:pPr>
       <w:r>
-        <w:t xml:space="preserve">1.  Click "Rewrite the whole chain" (the smart attacker). The hashes look consistent, but the </w:t>
+        <w:t xml:space="preserve">7.  Click "Rewrite the whole chain" (the smart attacker). The hashes look consistent, but the </w:t>
       </w:r>
       <w:r>
         <w:rPr>
@@ -1248,7 +1248,7 @@
         <w:ind w:left="510" w:hanging="340"/>
       </w:pPr>
       <w:r>
-        <w:t xml:space="preserve">2.  (Optional, 20 seconds) Click </w:t>
+        <w:t xml:space="preserve">8.  (Optional, 20 seconds) Click </w:t>
       </w:r>
       <w:r>
         <w:rPr>
@@ -1283,7 +1283,7 @@
         <w:ind w:left="510" w:hanging="340"/>
       </w:pPr>
       <w:r>
-        <w:t>3.  Close with the pitch line.</w:t>
+        <w:t>9.  Close with the pitch line.</w:t>
       </w:r>
     </w:p>
     <w:p>

</xml_diff>